<commit_message>
se añade plantillas para gestionar y descargar
</commit_message>
<xml_diff>
--- a/public/convenios/LGD-01.docx
+++ b/public/convenios/LGD-01.docx
@@ -14,6 +14,112 @@
       </w:pPr>
       <w:r>
         <w:rPr>
+          <w:rFonts w:asciiTheme="minorHAnsi" w:hAnsiTheme="minorHAnsi" w:cstheme="minorHAnsi"/>
+          <w:b/>
+          <w:sz w:val="22"/>
+          <w:szCs w:val="22"/>
+        </w:rPr>
+        <w:t xml:space="preserve">                                  </w:t>
+      </w:r>
+      <w:r>
+        <w:rPr>
+          <w:rFonts w:asciiTheme="minorHAnsi" w:hAnsiTheme="minorHAnsi" w:cstheme="minorHAnsi"/>
+          <w:b/>
+          <w:sz w:val="22"/>
+          <w:szCs w:val="22"/>
+        </w:rPr>
+        <w:t>ACUERDO DE DONACIÓN</w:t>
+      </w:r>
+    </w:p>
+    <w:p>
+      <w:pPr>
+        <w:rPr>
+          <w:rFonts w:asciiTheme="minorHAnsi" w:hAnsiTheme="minorHAnsi" w:cstheme="minorHAnsi"/>
+          <w:sz w:val="22"/>
+          <w:szCs w:val="22"/>
+        </w:rPr>
+      </w:pPr>
+    </w:p>
+    <w:p>
+      <w:pPr>
+        <w:ind w:left="1416" w:firstLine="708"/>
+        <w:jc w:val="right"/>
+        <w:rPr>
+          <w:rFonts w:asciiTheme="minorHAnsi" w:hAnsiTheme="minorHAnsi" w:cstheme="minorHAnsi"/>
+          <w:sz w:val="22"/>
+          <w:szCs w:val="22"/>
+        </w:rPr>
+      </w:pPr>
+      <w:r>
+        <w:rPr>
+          <w:rFonts w:asciiTheme="minorHAnsi" w:hAnsiTheme="minorHAnsi" w:cstheme="minorHAnsi"/>
+          <w:sz w:val="22"/>
+          <w:szCs w:val="22"/>
+        </w:rPr>
+        <w:t xml:space="preserve">      </w:t>
+      </w:r>
+      <w:r>
+        <w:rPr>
+          <w:rFonts w:asciiTheme="minorHAnsi" w:hAnsiTheme="minorHAnsi" w:cstheme="minorHAnsi"/>
+          <w:sz w:val="22"/>
+          <w:szCs w:val="22"/>
+        </w:rPr>
+        <w:tab/>
+      </w:r>
+      <w:r>
+        <w:rPr>
+          <w:rFonts w:asciiTheme="minorHAnsi" w:hAnsiTheme="minorHAnsi" w:cstheme="minorHAnsi"/>
+          <w:sz w:val="22"/>
+          <w:szCs w:val="22"/>
+        </w:rPr>
+        <w:tab/>
+        <w:t xml:space="preserve">  </w:t>
+      </w:r>
+    </w:p>
+    <w:p>
+      <w:pPr>
+        <w:ind w:left="1416" w:firstLine="708"/>
+        <w:jc w:val="right"/>
+        <w:rPr>
+          <w:rFonts w:asciiTheme="minorHAnsi" w:hAnsiTheme="minorHAnsi" w:cstheme="minorHAnsi"/>
+          <w:sz w:val="22"/>
+          <w:szCs w:val="22"/>
+        </w:rPr>
+      </w:pPr>
+      <w:r>
+        <w:rPr>
+          <w:rFonts w:asciiTheme="minorHAnsi" w:hAnsiTheme="minorHAnsi" w:cstheme="minorHAnsi"/>
+          <w:sz w:val="22"/>
+          <w:szCs w:val="22"/>
+        </w:rPr>
+        <w:t>En {{LUGAR_FIRMA}}, a {{FECHA_FIRMA}}</w:t>
+      </w:r>
+    </w:p>
+    <w:p>
+      <w:pPr>
+        <w:ind w:left="3540" w:firstLine="708"/>
+        <w:jc w:val="both"/>
+        <w:rPr>
+          <w:rFonts w:asciiTheme="minorHAnsi" w:hAnsiTheme="minorHAnsi" w:cstheme="minorHAnsi"/>
+          <w:b/>
+          <w:sz w:val="22"/>
+          <w:szCs w:val="22"/>
+        </w:rPr>
+      </w:pPr>
+    </w:p>
+    <w:p>
+      <w:pPr>
+        <w:ind w:left="3540" w:firstLine="708"/>
+        <w:jc w:val="both"/>
+        <w:rPr>
+          <w:rFonts w:asciiTheme="minorHAnsi" w:hAnsiTheme="minorHAnsi" w:cstheme="minorHAnsi"/>
+          <w:b/>
+          <w:sz w:val="22"/>
+          <w:szCs w:val="22"/>
+        </w:rPr>
+      </w:pPr>
+      <w:r>
+        <w:rPr>
           <w:rFonts w:eastAsiaTheme="minorEastAsia" w:cstheme="minorHAnsi"/>
           <w:b/>
           <w:bCs/>
@@ -23,16 +129,16 @@
         <mc:AlternateContent>
           <mc:Choice Requires="wps">
             <w:drawing>
-              <wp:anchor distT="0" distB="0" distL="114300" distR="114300" simplePos="0" relativeHeight="251664384" behindDoc="0" locked="0" layoutInCell="1" allowOverlap="1" wp14:anchorId="6E025D69" wp14:editId="2D21772E">
+              <wp:anchor distT="0" distB="0" distL="114300" distR="114300" simplePos="0" relativeHeight="251664384" behindDoc="0" locked="0" layoutInCell="1" allowOverlap="1" wp14:anchorId="6E025D69" wp14:editId="787CC4A1">
                 <wp:simplePos x="0" y="0"/>
                 <wp:positionH relativeFrom="column">
-                  <wp:posOffset>4429125</wp:posOffset>
+                  <wp:posOffset>4377690</wp:posOffset>
                 </wp:positionH>
                 <wp:positionV relativeFrom="paragraph">
-                  <wp:posOffset>-744855</wp:posOffset>
+                  <wp:posOffset>4445</wp:posOffset>
                 </wp:positionV>
-                <wp:extent cx="1402080" cy="464820"/>
-                <wp:effectExtent l="0" t="0" r="26670" b="11430"/>
+                <wp:extent cx="1684020" cy="792480"/>
+                <wp:effectExtent l="0" t="0" r="0" b="7620"/>
                 <wp:wrapNone/>
                 <wp:docPr id="2" name="Cuadro de texto 2"/>
                 <wp:cNvGraphicFramePr/>
@@ -43,7 +149,7 @@
                       <wps:spPr>
                         <a:xfrm>
                           <a:off x="0" y="0"/>
-                          <a:ext cx="1402080" cy="464820"/>
+                          <a:ext cx="1684020" cy="792480"/>
                         </a:xfrm>
                         <a:prstGeom prst="rect">
                           <a:avLst/>
@@ -52,9 +158,7 @@
                           <a:schemeClr val="lt1"/>
                         </a:solidFill>
                         <a:ln w="6350">
-                          <a:solidFill>
-                            <a:prstClr val="black"/>
-                          </a:solidFill>
+                          <a:noFill/>
                         </a:ln>
                       </wps:spPr>
                       <wps:txbx>
@@ -86,6 +190,9 @@
                 <wp14:sizeRelH relativeFrom="margin">
                   <wp14:pctWidth>0</wp14:pctWidth>
                 </wp14:sizeRelH>
+                <wp14:sizeRelV relativeFrom="margin">
+                  <wp14:pctHeight>0</wp14:pctHeight>
+                </wp14:sizeRelV>
               </wp:anchor>
             </w:drawing>
           </mc:Choice>
@@ -95,7 +202,7 @@
                 <v:stroke joinstyle="miter"/>
                 <v:path gradientshapeok="t" o:connecttype="rect"/>
               </v:shapetype>
-              <v:shape id="Cuadro de texto 2" o:spid="_x0000_s1026" type="#_x0000_t202" style="position:absolute;left:0;text-align:left;margin-left:348.75pt;margin-top:-58.65pt;width:110.4pt;height:36.6pt;z-index:251664384;visibility:visible;mso-wrap-style:square;mso-width-percent:0;mso-wrap-distance-left:9pt;mso-wrap-distance-top:0;mso-wrap-distance-right:9pt;mso-wrap-distance-bottom:0;mso-position-horizontal:absolute;mso-position-horizontal-relative:text;mso-position-vertical:absolute;mso-position-vertical-relative:text;mso-width-percent:0;mso-width-relative:margin;v-text-anchor:top" o:gfxdata="UEsDBBQABgAIAAAAIQC2gziS/gAAAOEBAAATAAAAW0NvbnRlbnRfVHlwZXNdLnhtbJSRQU7DMBBF 90jcwfIWJU67QAgl6YK0S0CoHGBkTxKLZGx5TGhvj5O2G0SRWNoz/78nu9wcxkFMGNg6quQqL6RA 0s5Y6ir5vt9lD1JwBDIwOMJKHpHlpr69KfdHjyxSmriSfYz+USnWPY7AufNIadK6MEJMx9ApD/oD OlTrorhX2lFEilmcO2RdNtjC5xDF9pCuTyYBB5bi6bQ4syoJ3g9WQ0ymaiLzg5KdCXlKLjvcW893 SUOqXwnz5DrgnHtJTxOsQfEKIT7DmDSUCaxw7Rqn8787ZsmRM9e2VmPeBN4uqYvTtW7jvijg9N/y JsXecLq0q+WD6m8AAAD//wMAUEsDBBQABgAIAAAAIQA4/SH/1gAAAJQBAAALAAAAX3JlbHMvLnJl bHOkkMFqwzAMhu+DvYPRfXGawxijTi+j0GvpHsDYimMaW0Yy2fr2M4PBMnrbUb/Q94l/f/hMi1qR JVI2sOt6UJgd+ZiDgffL8ekFlFSbvV0oo4EbChzGx4f9GRdb25HMsYhqlCwG5lrLq9biZkxWOiqY 22YiTra2kYMu1l1tQD30/bPm3wwYN0x18gb45AdQl1tp5j/sFB2T0FQ7R0nTNEV3j6o9feQzro1i OWA14Fm+Q8a1a8+Bvu/d/dMb2JY5uiPbhG/ktn4cqGU/er3pcvwCAAD//wMAUEsDBBQABgAIAAAA IQCFYF5zNgIAAHwEAAAOAAAAZHJzL2Uyb0RvYy54bWysVE1v2zAMvQ/YfxB0X+xkbpYZcYosRYYB QVsgHXpWZCk2JouapMTOfv0oxfnqdhp2kUmReiQfSU/vu0aRvbCuBl3Q4SClRGgOZa23Bf3+svww ocR5pkumQIuCHoSj97P376atycUIKlClsARBtMtbU9DKe5MnieOVaJgbgBEajRJswzyqdpuUlrWI 3qhklKbjpAVbGgtcOIe3D0cjnUV8KQX3T1I64YkqKObm42njuQlnMpuyfGuZqWrep8H+IYuG1RqD nqEemGdkZ+s/oJqaW3Ag/YBDk4CUNRexBqxmmL6pZl0xI2ItSI4zZ5rc/4Plj/u1ebbEd1+gwwYG QlrjcoeXoZ5O2iZ8MVOCdqTwcKZNdJ7w8ChLR+kETRxt2TibjCKvyeW1sc5/FdCQIBTUYlsiW2y/ ch4jouvJJQRzoOpyWSsVlTAKYqEs2TNsovIxR3xx46U0aQs6/niXRuAbW4A+v98oxn+EKm8RUFMa Ly+1B8l3m64nZAPlAXmycBwhZ/iyRtwVc/6ZWZwZrB/3wD/hIRVgMtBLlFRgf/3tPvhjK9FKSYsz WFD3c8esoER909jkz8MsC0MblezuE/JK7LVlc23Ru2YByNAQN87wKAZ/r06itNC84rrMQ1Q0Mc0x dkH9SVz442bgunExn0cnHFPD/EqvDQ/QoSOBz5fulVnT99PjJDzCaVpZ/qatR9/wUsN850HWseeB 4COrPe844rEt/TqGHbrWo9flpzH7DQAA//8DAFBLAwQUAAYACAAAACEAP2dm5t8AAAAMAQAADwAA AGRycy9kb3ducmV2LnhtbEyPPU/DMBCGdyT+g3VIbK1jKG0S4lSACgsTBTG7sWtHxOfIdtPw7zkm 2O7j0XvPNdvZD2wyMfUBJYhlAcxgF3SPVsLH+/OiBJayQq2GgEbCt0mwbS8vGlXrcMY3M+2zZRSC qVYSXM5jzXnqnPEqLcNokHbHEL3K1EbLdVRnCvcDvymKNfeqR7rg1GienOm+9icvYfdoK9uVKrpd qft+mj+Pr/ZFyuur+eEeWDZz/oPhV5/UoSWnQzihTmyQsK42d4RKWAixuQVGSCVKKg40Wq0E8Lbh /59ofwAAAP//AwBQSwECLQAUAAYACAAAACEAtoM4kv4AAADhAQAAEwAAAAAAAAAAAAAAAAAAAAAA W0NvbnRlbnRfVHlwZXNdLnhtbFBLAQItABQABgAIAAAAIQA4/SH/1gAAAJQBAAALAAAAAAAAAAAA AAAAAC8BAABfcmVscy8ucmVsc1BLAQItABQABgAIAAAAIQCFYF5zNgIAAHwEAAAOAAAAAAAAAAAA AAAAAC4CAABkcnMvZTJvRG9jLnhtbFBLAQItABQABgAIAAAAIQA/Z2bm3wAAAAwBAAAPAAAAAAAA AAAAAAAAAJAEAABkcnMvZG93bnJldi54bWxQSwUGAAAAAAQABADzAAAAnAUAAAAA " fillcolor="white [3201]" strokeweight=".5pt">
+              <v:shape id="Cuadro de texto 2" o:spid="_x0000_s1026" type="#_x0000_t202" style="position:absolute;left:0;text-align:left;margin-left:344.7pt;margin-top:.35pt;width:132.6pt;height:62.4pt;z-index:251664384;visibility:visible;mso-wrap-style:square;mso-width-percent:0;mso-height-percent:0;mso-wrap-distance-left:9pt;mso-wrap-distance-top:0;mso-wrap-distance-right:9pt;mso-wrap-distance-bottom:0;mso-position-horizontal:absolute;mso-position-horizontal-relative:text;mso-position-vertical:absolute;mso-position-vertical-relative:text;mso-width-percent:0;mso-height-percent:0;mso-width-relative:margin;mso-height-relative:margin;v-text-anchor:top" o:gfxdata="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" fillcolor="white [3201]" stroked="f" strokeweight=".5pt">
                 <v:textbox>
                   <w:txbxContent>
                     <w:p>
@@ -117,152 +224,7 @@
             </w:pict>
           </mc:Fallback>
         </mc:AlternateContent>
-        <w:drawing>
-          <wp:anchor distT="0" distB="0" distL="114300" distR="114300" simplePos="0" relativeHeight="251663360" behindDoc="1" locked="0" layoutInCell="1" allowOverlap="1" wp14:anchorId="7AF5A109" wp14:editId="14E1B1D0">
-            <wp:simplePos x="0" y="0"/>
-            <wp:positionH relativeFrom="margin">
-              <wp:posOffset>-668569</wp:posOffset>
-            </wp:positionH>
-            <wp:positionV relativeFrom="paragraph">
-              <wp:posOffset>-795260</wp:posOffset>
-            </wp:positionV>
-            <wp:extent cx="2049780" cy="789305"/>
-            <wp:effectExtent l="0" t="0" r="7620" b="0"/>
-            <wp:wrapNone/>
-            <wp:docPr id="5" name="Imagen 5"/>
-            <wp:cNvGraphicFramePr>
-              <a:graphicFrameLocks xmlns:a="http://schemas.openxmlformats.org/drawingml/2006/main" noChangeAspect="1"/>
-            </wp:cNvGraphicFramePr>
-            <a:graphic xmlns:a="http://schemas.openxmlformats.org/drawingml/2006/main">
-              <a:graphicData uri="http://schemas.openxmlformats.org/drawingml/2006/picture">
-                <pic:pic xmlns:pic="http://schemas.openxmlformats.org/drawingml/2006/picture">
-                  <pic:nvPicPr>
-                    <pic:cNvPr id="0" name="Imagen 2"/>
-                    <pic:cNvPicPr>
-                      <a:picLocks noChangeAspect="1" noChangeArrowheads="1"/>
-                    </pic:cNvPicPr>
-                  </pic:nvPicPr>
-                  <pic:blipFill>
-                    <a:blip r:embed="rId11">
-                      <a:extLst>
-                        <a:ext uri="{28A0092B-C50C-407E-A947-70E740481C1C}">
-                          <a14:useLocalDpi xmlns:a14="http://schemas.microsoft.com/office/drawing/2010/main" val="0"/>
-                        </a:ext>
-                      </a:extLst>
-                    </a:blip>
-                    <a:srcRect/>
-                    <a:stretch>
-                      <a:fillRect/>
-                    </a:stretch>
-                  </pic:blipFill>
-                  <pic:spPr bwMode="auto">
-                    <a:xfrm>
-                      <a:off x="0" y="0"/>
-                      <a:ext cx="2049780" cy="789305"/>
-                    </a:xfrm>
-                    <a:prstGeom prst="rect">
-                      <a:avLst/>
-                    </a:prstGeom>
-                    <a:noFill/>
-                    <a:ln>
-                      <a:noFill/>
-                    </a:ln>
-                  </pic:spPr>
-                </pic:pic>
-              </a:graphicData>
-            </a:graphic>
-            <wp14:sizeRelH relativeFrom="page">
-              <wp14:pctWidth>0</wp14:pctWidth>
-            </wp14:sizeRelH>
-            <wp14:sizeRelV relativeFrom="page">
-              <wp14:pctHeight>0</wp14:pctHeight>
-            </wp14:sizeRelV>
-          </wp:anchor>
-        </w:drawing>
-      </w:r>
-      <w:r>
-        <w:rPr>
-          <w:rFonts w:asciiTheme="minorHAnsi" w:hAnsiTheme="minorHAnsi" w:cstheme="minorHAnsi"/>
-          <w:b/>
-          <w:sz w:val="22"/>
-          <w:szCs w:val="22"/>
-        </w:rPr>
-        <w:t>ACUERDO DE DONACIÓN</w:t>
-      </w:r>
-    </w:p>
-    <w:p>
-      <w:pPr>
-        <w:rPr>
-          <w:rFonts w:asciiTheme="minorHAnsi" w:hAnsiTheme="minorHAnsi" w:cstheme="minorHAnsi"/>
-          <w:sz w:val="22"/>
-          <w:szCs w:val="22"/>
-        </w:rPr>
-      </w:pPr>
-    </w:p>
-    <w:p>
-      <w:pPr>
-        <w:ind w:left="1416" w:firstLine="708"/>
-        <w:jc w:val="right"/>
-        <w:rPr>
-          <w:rFonts w:asciiTheme="minorHAnsi" w:hAnsiTheme="minorHAnsi" w:cstheme="minorHAnsi"/>
-          <w:sz w:val="22"/>
-          <w:szCs w:val="22"/>
-        </w:rPr>
-      </w:pPr>
-      <w:r>
-        <w:rPr>
-          <w:rFonts w:asciiTheme="minorHAnsi" w:hAnsiTheme="minorHAnsi" w:cstheme="minorHAnsi"/>
-          <w:sz w:val="22"/>
-          <w:szCs w:val="22"/>
-        </w:rPr>
-        <w:t xml:space="preserve">      </w:t>
-        <w:tab/>
-        <w:tab/>
-        <w:t xml:space="preserve">  </w:t>
-      </w:r>
-    </w:p>
-    <w:p>
-      <w:pPr>
-        <w:ind w:left="1416" w:firstLine="708"/>
-        <w:jc w:val="right"/>
-        <w:rPr>
-          <w:rFonts w:asciiTheme="minorHAnsi" w:hAnsiTheme="minorHAnsi" w:cstheme="minorHAnsi"/>
-          <w:sz w:val="22"/>
-          <w:szCs w:val="22"/>
-        </w:rPr>
-      </w:pPr>
-      <w:r>
-        <w:rPr>
-          <w:rFonts w:asciiTheme="minorHAnsi" w:hAnsiTheme="minorHAnsi" w:cstheme="minorHAnsi"/>
-          <w:sz w:val="22"/>
-          <w:szCs w:val="22"/>
-        </w:rPr>
-        <w:t xml:space="preserve">En {{LUGAR_FIRMA}}, a {{FECHA_FIRMA}}</w:t>
-      </w:r>
-    </w:p>
-    <w:p>
-      <w:pPr>
-        <w:ind w:left="3540" w:firstLine="708"/>
-        <w:jc w:val="both"/>
-        <w:rPr>
-          <w:rFonts w:asciiTheme="minorHAnsi" w:hAnsiTheme="minorHAnsi" w:cstheme="minorHAnsi"/>
-          <w:b/>
-          <w:sz w:val="22"/>
-          <w:szCs w:val="22"/>
-        </w:rPr>
-      </w:pPr>
-    </w:p>
-    <w:p>
-      <w:pPr>
-        <w:ind w:left="3540" w:firstLine="708"/>
-        <w:jc w:val="both"/>
-        <w:rPr>
-          <w:rFonts w:asciiTheme="minorHAnsi" w:hAnsiTheme="minorHAnsi" w:cstheme="minorHAnsi"/>
-          <w:b/>
-          <w:sz w:val="22"/>
-          <w:szCs w:val="22"/>
-        </w:rPr>
-      </w:pPr>
+      </w:r>
     </w:p>
     <w:p>
       <w:pPr>
@@ -419,7 +381,7 @@
           <w:sz w:val="22"/>
           <w:szCs w:val="22"/>
         </w:rPr>
-        <w:t xml:space="preserve">{{NOMBRE_EMPRESA}}</w:t>
+        <w:t>{{NOMBRE_EMPRESA}}</w:t>
       </w:r>
       <w:r>
         <w:rPr>
@@ -435,23 +397,7 @@
           <w:sz w:val="22"/>
           <w:szCs w:val="22"/>
         </w:rPr>
-        <w:t xml:space="preserve"> con domicilio en c/ </w:t>
-      </w:r>
-      <w:r>
-        <w:rPr>
-          <w:rFonts w:asciiTheme="minorHAnsi" w:hAnsiTheme="minorHAnsi" w:cstheme="minorHAnsi"/>
-          <w:sz w:val="22"/>
-          <w:szCs w:val="22"/>
-        </w:rPr>
-        <w:t xml:space="preserve">{{DOMICILIO_EMPRESA}}</w:t>
-      </w:r>
-      <w:r>
-        <w:rPr>
-          <w:rFonts w:asciiTheme="minorHAnsi" w:hAnsiTheme="minorHAnsi" w:cstheme="minorHAnsi"/>
-          <w:sz w:val="22"/>
-          <w:szCs w:val="22"/>
-        </w:rPr>
-        <w:t xml:space="preserve"> representado en este acto por </w:t>
+        <w:t xml:space="preserve"> con domicilio en c/ {{DOMICILIO_EMPRESA}} representado en este acto por </w:t>
       </w:r>
       <w:r>
         <w:rPr>
@@ -459,7 +405,7 @@
           <w:sz w:val="22"/>
           <w:szCs w:val="22"/>
         </w:rPr>
-        <w:t xml:space="preserve">{{REPRESENTANTE}}</w:t>
+        <w:t>{{REPRESENTANTE}}</w:t>
       </w:r>
       <w:r>
         <w:rPr>
@@ -475,7 +421,7 @@
           <w:sz w:val="22"/>
           <w:szCs w:val="22"/>
         </w:rPr>
-        <w:t xml:space="preserve">{{DNI_REPRESENTANTE}}</w:t>
+        <w:t>{{DNI_REPRESENTANTE}}</w:t>
       </w:r>
       <w:r>
         <w:rPr>
@@ -491,63 +437,15 @@
           <w:sz w:val="22"/>
           <w:szCs w:val="22"/>
         </w:rPr>
-        <w:t xml:space="preserve">{{CARGO}}</w:t>
-      </w:r>
-      <w:r>
-        <w:rPr>
-          <w:rFonts w:asciiTheme="minorHAnsi" w:hAnsiTheme="minorHAnsi" w:cstheme="minorHAnsi"/>
-          <w:sz w:val="22"/>
-          <w:szCs w:val="22"/>
-        </w:rPr>
-        <w:t xml:space="preserve"> según consta en la escritura de poder otorgada por </w:t>
-      </w:r>
-      <w:r>
-        <w:rPr>
-          <w:rFonts w:asciiTheme="minorHAnsi" w:hAnsiTheme="minorHAnsi" w:cstheme="minorHAnsi"/>
-          <w:sz w:val="22"/>
-          <w:szCs w:val="22"/>
-        </w:rPr>
-        <w:t xml:space="preserve">__________</w:t>
-      </w:r>
-      <w:r>
-        <w:rPr>
-          <w:rFonts w:asciiTheme="minorHAnsi" w:hAnsiTheme="minorHAnsi" w:cstheme="minorHAnsi"/>
-          <w:sz w:val="22"/>
-          <w:szCs w:val="22"/>
-        </w:rPr>
-        <w:t xml:space="preserve"> en la fecha </w:t>
-      </w:r>
-      <w:r>
-        <w:rPr>
-          <w:rFonts w:asciiTheme="minorHAnsi" w:hAnsiTheme="minorHAnsi" w:cstheme="minorHAnsi"/>
-          <w:sz w:val="22"/>
-          <w:szCs w:val="22"/>
-        </w:rPr>
-        <w:t xml:space="preserve">__________</w:t>
-      </w:r>
-      <w:r>
-        <w:rPr>
-          <w:rFonts w:asciiTheme="minorHAnsi" w:hAnsiTheme="minorHAnsi" w:cstheme="minorHAnsi"/>
-          <w:sz w:val="22"/>
-          <w:szCs w:val="22"/>
-        </w:rPr>
-        <w:t xml:space="preserve">, con el número </w:t>
-      </w:r>
-      <w:r>
-        <w:rPr>
-          <w:rFonts w:asciiTheme="minorHAnsi" w:hAnsiTheme="minorHAnsi" w:cstheme="minorHAnsi"/>
-          <w:sz w:val="22"/>
-          <w:szCs w:val="22"/>
-        </w:rPr>
-        <w:t xml:space="preserve">__________</w:t>
-      </w:r>
-      <w:r>
-        <w:rPr>
-          <w:rFonts w:asciiTheme="minorHAnsi" w:hAnsiTheme="minorHAnsi" w:cstheme="minorHAnsi"/>
-          <w:sz w:val="22"/>
-          <w:szCs w:val="22"/>
-        </w:rPr>
-        <w:t xml:space="preserve"> de protocolo.</w:t>
+        <w:t>{{CARGO}}</w:t>
+      </w:r>
+      <w:r>
+        <w:rPr>
+          <w:rFonts w:asciiTheme="minorHAnsi" w:hAnsiTheme="minorHAnsi" w:cstheme="minorHAnsi"/>
+          <w:sz w:val="22"/>
+          <w:szCs w:val="22"/>
+        </w:rPr>
+        <w:t xml:space="preserve"> según consta en la escritura de poder otorgada por __________ en la fecha __________, con el número __________ de protocolo.</w:t>
       </w:r>
     </w:p>
     <w:p>
@@ -853,7 +751,25 @@
           <w:sz w:val="22"/>
           <w:szCs w:val="22"/>
         </w:rPr>
-        <w:t>, tiene personalidad jurídica propia y goza de capacidad de obrar, rigiéndose en cuanto a su organización y funcionamiento por sus Estatutos de Constitución y por las demás normas y disposiciones que, en interpretación y desarrollo de los mismos, establezca su Patronato.</w:t>
+        <w:t xml:space="preserve">, tiene personalidad jurídica propia y goza de capacidad de obrar, rigiéndose en cuanto a su organización y funcionamiento por sus Estatutos de Constitución y por las demás normas y disposiciones que, en interpretación y desarrollo de </w:t>
+      </w:r>
+      <w:proofErr w:type="gramStart"/>
+      <w:r>
+        <w:rPr>
+          <w:rFonts w:asciiTheme="minorHAnsi" w:hAnsiTheme="minorHAnsi" w:cstheme="minorHAnsi"/>
+          <w:sz w:val="22"/>
+          <w:szCs w:val="22"/>
+        </w:rPr>
+        <w:t>los mismos</w:t>
+      </w:r>
+      <w:proofErr w:type="gramEnd"/>
+      <w:r>
+        <w:rPr>
+          <w:rFonts w:asciiTheme="minorHAnsi" w:hAnsiTheme="minorHAnsi" w:cstheme="minorHAnsi"/>
+          <w:sz w:val="22"/>
+          <w:szCs w:val="22"/>
+        </w:rPr>
+        <w:t>, establezca su Patronato.</w:t>
       </w:r>
     </w:p>
     <w:p>
@@ -936,23 +852,15 @@
           <w:sz w:val="22"/>
           <w:szCs w:val="22"/>
         </w:rPr>
-        <w:t xml:space="preserve">{{NOMBRE_EMPRESA}}</w:t>
-      </w:r>
-      <w:r>
-        <w:rPr>
-          <w:rFonts w:asciiTheme="minorHAnsi" w:hAnsiTheme="minorHAnsi" w:cstheme="minorHAnsi"/>
-          <w:sz w:val="22"/>
-          <w:szCs w:val="22"/>
-        </w:rPr>
-        <w:t xml:space="preserve"> es una sociedad que tiene personalidad jurídica y capacidad de obrar propias, cuya actividad principal consiste en </w:t>
-      </w:r>
-      <w:r>
-        <w:rPr>
-          <w:rFonts w:asciiTheme="minorHAnsi" w:hAnsiTheme="minorHAnsi" w:cstheme="minorHAnsi"/>
-          <w:sz w:val="22"/>
-          <w:szCs w:val="22"/>
-        </w:rPr>
-        <w:t xml:space="preserve">{{ACTIVIDAD_PRINCIPAL}}</w:t>
+        <w:t>{{NOMBRE_EMPRESA}}</w:t>
+      </w:r>
+      <w:r>
+        <w:rPr>
+          <w:rFonts w:asciiTheme="minorHAnsi" w:hAnsiTheme="minorHAnsi" w:cstheme="minorHAnsi"/>
+          <w:sz w:val="22"/>
+          <w:szCs w:val="22"/>
+        </w:rPr>
+        <w:t xml:space="preserve"> es una sociedad que tiene personalidad jurídica y capacidad de obrar propias, cuya actividad principal consiste en {{ACTIVIDAD_PRINCIPAL}}</w:t>
       </w:r>
     </w:p>
     <w:p>
@@ -998,7 +906,7 @@
           <w:sz w:val="22"/>
           <w:szCs w:val="22"/>
         </w:rPr>
-        <w:t xml:space="preserve">{{NOMBRE_EMPRESA}}</w:t>
+        <w:t>{{NOMBRE_EMPRESA}}</w:t>
       </w:r>
       <w:r>
         <w:rPr>
@@ -1241,7 +1149,7 @@
           <w:sz w:val="22"/>
           <w:szCs w:val="22"/>
         </w:rPr>
-        <w:t xml:space="preserve">{{NOMBRE_EMPRESA}}</w:t>
+        <w:t>{{NOMBRE_EMPRESA}}</w:t>
       </w:r>
       <w:r>
         <w:rPr>
@@ -1362,7 +1270,7 @@
           <w:sz w:val="22"/>
           <w:szCs w:val="22"/>
         </w:rPr>
-        <w:t xml:space="preserve">{{NOMBRE_EMPRESA}}</w:t>
+        <w:t>{{NOMBRE_EMPRESA}}</w:t>
       </w:r>
       <w:r>
         <w:rPr>
@@ -1486,7 +1394,6 @@
           <w:sz w:val="22"/>
           <w:szCs w:val="22"/>
         </w:rPr>
-        <w:lastRenderedPageBreak/>
         <w:t>El abono de la Donación se efectuará a</w:t>
       </w:r>
       <w:r>
@@ -1986,23 +1893,25 @@
           <w:sz w:val="22"/>
           <w:szCs w:val="22"/>
         </w:rPr>
-        <w:t xml:space="preserve">En atención a la aplicación de las medidas alternativas de carácter excepcional establecidas por el por el Real Decreto 364/2005 para el cumplimiento de la Ley General de Derechos de las Personas con Discapacidad y de su Inclusión Social, las Partes establecen la vigencia del presente Acuerdo por el plazo de </w:t>
-      </w:r>
-      <w:r>
-        <w:rPr>
-          <w:rFonts w:asciiTheme="minorHAnsi" w:hAnsiTheme="minorHAnsi" w:cstheme="minorHAnsi"/>
-          <w:sz w:val="22"/>
-          <w:szCs w:val="22"/>
-        </w:rPr>
-        <w:t xml:space="preserve">{{PLAZO_ANIOS}}  desde la fecha de su firma</w:t>
-      </w:r>
-      <w:r>
-        <w:rPr>
-          <w:rFonts w:asciiTheme="minorHAnsi" w:hAnsiTheme="minorHAnsi" w:cstheme="minorHAnsi"/>
-          <w:sz w:val="22"/>
-          <w:szCs w:val="22"/>
-        </w:rPr>
-        <w:t>. En cualquier caso, una vez finalizado el presente Acuerdo, éste podrá prorrogarse por acuerdo expreso y por escrito de ambas Partes y por periodos de igual duración.</w:t>
+        <w:t>En atención a la aplicación de las medidas alternativas de carácter excepcional establecidas por el por el Real Decreto 364/2005 para el cumplimiento de la Ley General de Derechos de las Personas con Discapacidad y de su Inclusión Social, las Partes establecen la vigencia del presente Acuerdo por el plazo de {{PLAZO_ANIOS</w:t>
+      </w:r>
+      <w:proofErr w:type="gramStart"/>
+      <w:r>
+        <w:rPr>
+          <w:rFonts w:asciiTheme="minorHAnsi" w:hAnsiTheme="minorHAnsi" w:cstheme="minorHAnsi"/>
+          <w:sz w:val="22"/>
+          <w:szCs w:val="22"/>
+        </w:rPr>
+        <w:t>}}  desde</w:t>
+      </w:r>
+      <w:proofErr w:type="gramEnd"/>
+      <w:r>
+        <w:rPr>
+          <w:rFonts w:asciiTheme="minorHAnsi" w:hAnsiTheme="minorHAnsi" w:cstheme="minorHAnsi"/>
+          <w:sz w:val="22"/>
+          <w:szCs w:val="22"/>
+        </w:rPr>
+        <w:t xml:space="preserve"> la fecha de su firma. En cualquier caso, una vez finalizado el presente Acuerdo, éste podrá prorrogarse por acuerdo expreso y por escrito de ambas Partes y por periodos de igual duración.</w:t>
       </w:r>
     </w:p>
     <w:p>
@@ -2076,6 +1985,7 @@
           <w:sz w:val="22"/>
           <w:szCs w:val="22"/>
         </w:rPr>
+        <w:lastRenderedPageBreak/>
         <w:t>Serán causas de resolución del presente Acuerdo el incumplimiento total o parcial o, el cumplimiento defectuoso, de las obligaciones asumidas por las Partes incluidas las que se derivan de obligaciones legales y autorizaciones administrativas</w:t>
       </w:r>
     </w:p>
@@ -2107,7 +2017,6 @@
           <w:sz w:val="22"/>
           <w:szCs w:val="22"/>
         </w:rPr>
-        <w:lastRenderedPageBreak/>
         <w:t>Sexta. - Protección de datos</w:t>
       </w:r>
     </w:p>
@@ -2223,36 +2132,90 @@
           <w:sz w:val="22"/>
           <w:szCs w:val="22"/>
         </w:rPr>
-        <w:t>Por tanto, las Partes expresamente acuerdan que cada una de ellas actúa como Responsable del Tratamiento de los Datos Personales recopilados y tratados para la gestión de la relación contractual como se define anteriormente.</w:t>
-      </w:r>
-    </w:p>
-    <w:p>
-      <w:pPr>
-        <w:jc w:val="both"/>
-        <w:rPr>
-          <w:rFonts w:asciiTheme="minorHAnsi" w:hAnsiTheme="minorHAnsi" w:cstheme="minorHAnsi"/>
-          <w:sz w:val="22"/>
-          <w:szCs w:val="22"/>
-          <w:lang w:val="es-ES_tradnl"/>
-        </w:rPr>
-      </w:pPr>
-    </w:p>
-    <w:p>
-      <w:pPr>
-        <w:jc w:val="both"/>
-        <w:rPr>
-          <w:rFonts w:asciiTheme="minorHAnsi" w:hAnsiTheme="minorHAnsi" w:cstheme="minorHAnsi"/>
-          <w:sz w:val="22"/>
-          <w:szCs w:val="22"/>
-        </w:rPr>
-      </w:pPr>
-      <w:r>
-        <w:rPr>
-          <w:rFonts w:asciiTheme="minorHAnsi" w:hAnsiTheme="minorHAnsi" w:cstheme="minorHAnsi"/>
-          <w:sz w:val="22"/>
-          <w:szCs w:val="22"/>
-        </w:rPr>
-        <w:t>Así mismo, las Partes manifiestan que el Delegado de Protección de Datos es la figura encargada de hacer efectivo el cumplimiento de la normativa de protección de datos. Los interesados podrán ponerse en contacto con el Delegado de Protección de Datos cuyos datos de contacto se indican a continuación:</w:t>
+        <w:t xml:space="preserve">Por tanto, las Partes expresamente acuerdan que cada una de ellas actúa como </w:t>
+      </w:r>
+      <w:proofErr w:type="gramStart"/>
+      <w:r>
+        <w:rPr>
+          <w:rFonts w:asciiTheme="minorHAnsi" w:hAnsiTheme="minorHAnsi" w:cstheme="minorBidi"/>
+          <w:sz w:val="22"/>
+          <w:szCs w:val="22"/>
+        </w:rPr>
+        <w:t>Responsable</w:t>
+      </w:r>
+      <w:proofErr w:type="gramEnd"/>
+      <w:r>
+        <w:rPr>
+          <w:rFonts w:asciiTheme="minorHAnsi" w:hAnsiTheme="minorHAnsi" w:cstheme="minorBidi"/>
+          <w:sz w:val="22"/>
+          <w:szCs w:val="22"/>
+        </w:rPr>
+        <w:t xml:space="preserve"> del Tratamiento de los Datos Personales recopilados y tratados para la gestión de la relación contractual como se define anteriormente.</w:t>
+      </w:r>
+    </w:p>
+    <w:p>
+      <w:pPr>
+        <w:jc w:val="both"/>
+        <w:rPr>
+          <w:rFonts w:asciiTheme="minorHAnsi" w:hAnsiTheme="minorHAnsi" w:cstheme="minorHAnsi"/>
+          <w:sz w:val="22"/>
+          <w:szCs w:val="22"/>
+          <w:lang w:val="es-ES_tradnl"/>
+        </w:rPr>
+      </w:pPr>
+    </w:p>
+    <w:p>
+      <w:pPr>
+        <w:jc w:val="both"/>
+        <w:rPr>
+          <w:rFonts w:asciiTheme="minorHAnsi" w:hAnsiTheme="minorHAnsi" w:cstheme="minorHAnsi"/>
+          <w:sz w:val="22"/>
+          <w:szCs w:val="22"/>
+        </w:rPr>
+      </w:pPr>
+      <w:r>
+        <w:rPr>
+          <w:rFonts w:asciiTheme="minorHAnsi" w:hAnsiTheme="minorHAnsi" w:cstheme="minorHAnsi"/>
+          <w:sz w:val="22"/>
+          <w:szCs w:val="22"/>
+        </w:rPr>
+        <w:t xml:space="preserve">Así mismo, las Partes manifiestan que el </w:t>
+      </w:r>
+      <w:proofErr w:type="gramStart"/>
+      <w:r>
+        <w:rPr>
+          <w:rFonts w:asciiTheme="minorHAnsi" w:hAnsiTheme="minorHAnsi" w:cstheme="minorHAnsi"/>
+          <w:sz w:val="22"/>
+          <w:szCs w:val="22"/>
+        </w:rPr>
+        <w:t>Delegado</w:t>
+      </w:r>
+      <w:proofErr w:type="gramEnd"/>
+      <w:r>
+        <w:rPr>
+          <w:rFonts w:asciiTheme="minorHAnsi" w:hAnsiTheme="minorHAnsi" w:cstheme="minorHAnsi"/>
+          <w:sz w:val="22"/>
+          <w:szCs w:val="22"/>
+        </w:rPr>
+        <w:t xml:space="preserve"> de Protección de Datos es la figura encargada de hacer efectivo el cumplimiento de la normativa de protección de datos. Los interesados podrán ponerse en contacto con el </w:t>
+      </w:r>
+      <w:proofErr w:type="gramStart"/>
+      <w:r>
+        <w:rPr>
+          <w:rFonts w:asciiTheme="minorHAnsi" w:hAnsiTheme="minorHAnsi" w:cstheme="minorHAnsi"/>
+          <w:sz w:val="22"/>
+          <w:szCs w:val="22"/>
+        </w:rPr>
+        <w:t>Delegado</w:t>
+      </w:r>
+      <w:proofErr w:type="gramEnd"/>
+      <w:r>
+        <w:rPr>
+          <w:rFonts w:asciiTheme="minorHAnsi" w:hAnsiTheme="minorHAnsi" w:cstheme="minorHAnsi"/>
+          <w:sz w:val="22"/>
+          <w:szCs w:val="22"/>
+        </w:rPr>
+        <w:t xml:space="preserve"> de Protección de Datos cuyos datos de contacto se indican a continuación:</w:t>
       </w:r>
     </w:p>
     <w:p>
@@ -2342,31 +2305,15 @@
           <w:sz w:val="22"/>
           <w:szCs w:val="22"/>
         </w:rPr>
-        <w:t xml:space="preserve">{{NOMBRE_EMPRESA}}</w:t>
-      </w:r>
-      <w:r>
-        <w:rPr>
-          <w:rFonts w:asciiTheme="minorHAnsi" w:hAnsiTheme="minorHAnsi" w:cstheme="minorHAnsi"/>
-          <w:sz w:val="22"/>
-          <w:szCs w:val="22"/>
-        </w:rPr>
-        <w:t xml:space="preserve">: </w:t>
-      </w:r>
-      <w:r>
-        <w:rPr>
-          <w:rFonts w:asciiTheme="minorHAnsi" w:hAnsiTheme="minorHAnsi" w:cstheme="minorHAnsi"/>
-          <w:sz w:val="22"/>
-          <w:szCs w:val="22"/>
-        </w:rPr>
-        <w:t xml:space="preserve">{{EMAIL_DPO}}</w:t>
-      </w:r>
-      <w:r>
-        <w:rPr>
-          <w:rFonts w:asciiTheme="minorHAnsi" w:hAnsiTheme="minorHAnsi" w:cstheme="minorHAnsi"/>
-          <w:sz w:val="22"/>
-          <w:szCs w:val="22"/>
-        </w:rPr>
-        <w:t xml:space="preserve"> </w:t>
+        <w:t>{{NOMBRE_EMPRESA}}</w:t>
+      </w:r>
+      <w:r>
+        <w:rPr>
+          <w:rFonts w:asciiTheme="minorHAnsi" w:hAnsiTheme="minorHAnsi" w:cstheme="minorHAnsi"/>
+          <w:sz w:val="22"/>
+          <w:szCs w:val="22"/>
+        </w:rPr>
+        <w:t xml:space="preserve">: {{EMAIL_DPO}} </w:t>
       </w:r>
     </w:p>
     <w:p>
@@ -2580,7 +2527,6 @@
           <w:sz w:val="22"/>
           <w:szCs w:val="22"/>
         </w:rPr>
-        <w:lastRenderedPageBreak/>
         <w:t>Novena. – Jurisdicción y competencia</w:t>
       </w:r>
     </w:p>
@@ -2725,6 +2671,14 @@
           <w:szCs w:val="22"/>
         </w:rPr>
         <w:tab/>
+      </w:r>
+      <w:r>
+        <w:rPr>
+          <w:rFonts w:asciiTheme="minorHAnsi" w:hAnsiTheme="minorHAnsi" w:cstheme="minorHAnsi"/>
+          <w:b/>
+          <w:sz w:val="22"/>
+          <w:szCs w:val="22"/>
+        </w:rPr>
         <w:tab/>
       </w:r>
     </w:p>
@@ -2768,7 +2722,7 @@
                 <w:sz w:val="22"/>
                 <w:szCs w:val="22"/>
               </w:rPr>
-              <w:t xml:space="preserve">{{NOMBRE_EMPRESA}}.</w:t>
+              <w:t>{{NOMBRE_EMPRESA}}.</w:t>
             </w:r>
           </w:p>
           <w:p>
@@ -2808,7 +2762,6 @@
                 <w:rFonts w:asciiTheme="minorHAnsi" w:hAnsiTheme="minorHAnsi" w:cstheme="minorHAnsi"/>
                 <w:sz w:val="22"/>
                 <w:szCs w:val="22"/>
-                <w:lang w:val="en-US"/>
               </w:rPr>
             </w:pPr>
             <w:r>
@@ -2816,9 +2769,15 @@
                 <w:rFonts w:asciiTheme="minorHAnsi" w:hAnsiTheme="minorHAnsi" w:cstheme="minorHAnsi"/>
                 <w:sz w:val="22"/>
                 <w:szCs w:val="22"/>
-                <w:lang w:val="en-US"/>
               </w:rPr>
               <w:t>___________________________</w:t>
+            </w:r>
+            <w:r>
+              <w:rPr>
+                <w:rFonts w:asciiTheme="minorHAnsi" w:hAnsiTheme="minorHAnsi" w:cstheme="minorHAnsi"/>
+                <w:sz w:val="22"/>
+                <w:szCs w:val="22"/>
+              </w:rPr>
               <w:tab/>
             </w:r>
             <w:r>
@@ -2827,7 +2786,6 @@
                 <w:b/>
                 <w:sz w:val="22"/>
                 <w:szCs w:val="22"/>
-                <w:lang w:val="en-US"/>
               </w:rPr>
               <w:t xml:space="preserve">  </w:t>
             </w:r>
@@ -2840,7 +2798,6 @@
                 <w:b/>
                 <w:sz w:val="22"/>
                 <w:szCs w:val="22"/>
-                <w:lang w:val="en-US"/>
               </w:rPr>
             </w:pPr>
             <w:r>
@@ -2850,7 +2807,7 @@
                 <w:sz w:val="22"/>
                 <w:szCs w:val="22"/>
               </w:rPr>
-              <w:t xml:space="preserve">D. / Dª {{REPRESENTANTE}}</w:t>
+              <w:t>D. / Dª {{REPRESENTANTE}}</w:t>
             </w:r>
           </w:p>
         </w:tc>
@@ -2865,7 +2822,6 @@
                 <w:rFonts w:asciiTheme="minorHAnsi" w:hAnsiTheme="minorHAnsi" w:cstheme="minorHAnsi"/>
                 <w:sz w:val="22"/>
                 <w:szCs w:val="22"/>
-                <w:lang w:val="en-US"/>
               </w:rPr>
             </w:pPr>
           </w:p>
@@ -3109,7 +3065,7 @@
           <w:szCs w:val="22"/>
           <w:lang w:val="es-ES_tradnl"/>
         </w:rPr>
-        <w:t xml:space="preserve">Nombre/razón social: {{NOMBRE_EMPRESA}}</w:t>
+        <w:t>Nombre/razón social: {{NOMBRE_EMPRESA}}</w:t>
       </w:r>
     </w:p>
     <w:p>
@@ -3132,7 +3088,7 @@
           <w:szCs w:val="22"/>
           <w:lang w:val="es-ES_tradnl"/>
         </w:rPr>
-        <w:t xml:space="preserve">NIF: {{NIF_EMPRESA}}</w:t>
+        <w:t>NIF: {{NIF_EMPRESA}}</w:t>
       </w:r>
     </w:p>
     <w:p>
@@ -3155,7 +3111,7 @@
           <w:szCs w:val="22"/>
           <w:lang w:val="es-ES_tradnl"/>
         </w:rPr>
-        <w:t xml:space="preserve">Domicilio: {{DOMICILIO_EMPRESA}}</w:t>
+        <w:t>Domicilio: {{DOMICILIO_EMPRESA}}</w:t>
       </w:r>
     </w:p>
     <w:p>
@@ -3191,7 +3147,7 @@
           <w:sz w:val="22"/>
           <w:szCs w:val="22"/>
         </w:rPr>
-        <w:t xml:space="preserve">En {{LUGAR_FIRMA}}, a {{FECHA_FIRMA}}</w:t>
+        <w:t>En {{LUGAR_FIRMA}}, a {{FECHA_FIRMA}}</w:t>
       </w:r>
     </w:p>
     <w:p>
@@ -3319,11 +3275,7 @@
           </mc:Choice>
           <mc:Fallback>
             <w:pict>
-              <v:shapetype w14:anchorId="576762B2" id="_x0000_t202" coordsize="21600,21600" o:spt="202" path="m,l,21600r21600,l21600,xe">
-                <v:stroke joinstyle="miter"/>
-                <v:path gradientshapeok="t" o:connecttype="rect"/>
-              </v:shapetype>
-              <v:shape id="Cuadro de texto 4" o:spid="_x0000_s1027" type="#_x0000_t202" style="position:absolute;left:0;text-align:left;margin-left:92.95pt;margin-top:2.9pt;width:8.45pt;height:8.45pt;z-index:251661312;visibility:visible;mso-wrap-style:square;mso-wrap-distance-left:9pt;mso-wrap-distance-top:0;mso-wrap-distance-right:9pt;mso-wrap-distance-bottom:0;mso-position-horizontal:absolute;mso-position-horizontal-relative:text;mso-position-vertical:absolute;mso-position-vertical-relative:text;v-text-anchor:top" o:gfxdata="UEsDBBQABgAIAAAAIQC2gziS/gAAAOEBAAATAAAAW0NvbnRlbnRfVHlwZXNdLnhtbJSRQU7DMBBF 90jcwfIWJU67QAgl6YK0S0CoHGBkTxKLZGx5TGhvj5O2G0SRWNoz/78nu9wcxkFMGNg6quQqL6RA 0s5Y6ir5vt9lD1JwBDIwOMJKHpHlpr69KfdHjyxSmriSfYz+USnWPY7AufNIadK6MEJMx9ApD/oD OlTrorhX2lFEilmcO2RdNtjC5xDF9pCuTyYBB5bi6bQ4syoJ3g9WQ0ymaiLzg5KdCXlKLjvcW893 SUOqXwnz5DrgnHtJTxOsQfEKIT7DmDSUCaxw7Rqn8787ZsmRM9e2VmPeBN4uqYvTtW7jvijg9N/y JsXecLq0q+WD6m8AAAD//wMAUEsDBBQABgAIAAAAIQA4/SH/1gAAAJQBAAALAAAAX3JlbHMvLnJl bHOkkMFqwzAMhu+DvYPRfXGawxijTi+j0GvpHsDYimMaW0Yy2fr2M4PBMnrbUb/Q94l/f/hMi1qR JVI2sOt6UJgd+ZiDgffL8ekFlFSbvV0oo4EbChzGx4f9GRdb25HMsYhqlCwG5lrLq9biZkxWOiqY 22YiTra2kYMu1l1tQD30/bPm3wwYN0x18gb45AdQl1tp5j/sFB2T0FQ7R0nTNEV3j6o9feQzro1i OWA14Fm+Q8a1a8+Bvu/d/dMb2JY5uiPbhG/ktn4cqGU/er3pcvwCAAD//wMAUEsDBBQABgAIAAAA IQC8EgtRUgIAAAQFAAAOAAAAZHJzL2Uyb0RvYy54bWysVE1v2zAMvQ/YfxB0X+wE3boadYqsRYcB RVs0HXpWZKkxJouaxMTOfv0o2XGCLthh2EWmRD5+PvryqmsM2yofarAln05yzpSVUNX2teTfn28/ fOYsoLCVMGBVyXcq8Kv5+3eXrSvUDNZgKuUZObGhaF3J14iuyLIg16oRYQJOWVJq8I1AuvrXrPKi Je+NyWZ5/ilrwVfOg1Qh0OtNr+Tz5F9rJfFB66CQmZJTbphOn85VPLP5pShevXDrWg5piH/IohG1 paCjqxuBgm18/YerppYeAmicSGgy0LqWKtVA1UzzN9Us18KpVAs1J7ixTeH/uZX326V79Ay7L9DR AGNDWheKQI+xnk77Jn4pU0Z6auFubJvqkMkIys/zixlnklSDTF6yA9j5gF8VNCwKJfc0ldQssb0L 2JvuTWIsY+PbIYsk4c6oXvmkNKsrijtLThJV1LXxbCtoyNWPVANFN5YsI0TXxoyg6SmQwT1osI0w legzAvNTwEO00TpFBIsjsKkt+L+DdW+/r7qvNZaN3aqjYo8Gs4JqR/Py0FM5OHlbU1fvRMBH4Ym7 NCLaR3ygQxtoSw6DxNka/K9T79GeKEVazlrahZKHnxvhFWfmmyWyXUzPzuLypMvZx/MZXfyxZnWs sZvmGmgSU9p8J5MY7dHsRe2heaG1XcSopBJWUuyS4168xn5Dae2lWiySEa2LE3hnl05G17HLkTPP 3YvwbiAWEiPvYb81onjDr942Ii0sNgi6TuSLfe67OvSfVi3Rd/gtxF0+vierw89r/hsAAP//AwBQ SwMEFAAGAAgAAAAhAI4+4VTdAAAACAEAAA8AAABkcnMvZG93bnJldi54bWxMT01Lw0AUvAv+h+UJ XqTdGKzWmE0phR6ESrEW8fiSXbPB3bchu21jf73Pk95mmGE+ysXonTiaIXaBFNxOMxCGmqA7ahXs 39aTOYiYkDS6QEbBt4mwqC4vSix0ONGrOe5SKziEYoEKbEp9IWVsrPEYp6E3xNpnGDwmpkMr9YAn DvdO5ll2Lz12xA0We7OypvnaHbwC3Nq6i+cXd1590HL9fLfB95uNUtdX4/IJRDJj+jPD73yeDhVv qsOBdBSO+Xz2yFYFM37Aep7lDGoG+QPIqpT/D1Q/AAAA//8DAFBLAQItABQABgAIAAAAIQC2gziS /gAAAOEBAAATAAAAAAAAAAAAAAAAAAAAAABbQ29udGVudF9UeXBlc10ueG1sUEsBAi0AFAAGAAgA AAAhADj9If/WAAAAlAEAAAsAAAAAAAAAAAAAAAAALwEAAF9yZWxzLy5yZWxzUEsBAi0AFAAGAAgA AAAhALwSC1FSAgAABAUAAA4AAAAAAAAAAAAAAAAALgIAAGRycy9lMm9Eb2MueG1sUEsBAi0AFAAG AAgAAAAhAI4+4VTdAAAACAEAAA8AAAAAAAAAAAAAAAAArAQAAGRycy9kb3ducmV2LnhtbFBLBQYA AAAABAAEAPMAAAC2BQAAAAA= " fillcolor="white [3201]" strokecolor="black [3200]" strokeweight="2pt">
+              <v:shape w14:anchorId="576762B2" id="Cuadro de texto 4" o:spid="_x0000_s1027" type="#_x0000_t202" style="position:absolute;left:0;text-align:left;margin-left:92.95pt;margin-top:2.9pt;width:8.45pt;height:8.45pt;z-index:251661312;visibility:visible;mso-wrap-style:square;mso-wrap-distance-left:9pt;mso-wrap-distance-top:0;mso-wrap-distance-right:9pt;mso-wrap-distance-bottom:0;mso-position-horizontal:absolute;mso-position-horizontal-relative:text;mso-position-vertical:absolute;mso-position-vertical-relative:text;v-text-anchor:top" o:gfxdata="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" fillcolor="white [3201]" strokecolor="black [3200]" strokeweight="2pt">
                 <v:textbox>
                   <w:txbxContent>
                     <w:p/>
@@ -3333,6 +3285,15 @@
             </w:pict>
           </mc:Fallback>
         </mc:AlternateContent>
+      </w:r>
+      <w:r>
+        <w:rPr>
+          <w:rFonts w:asciiTheme="minorHAnsi" w:hAnsiTheme="minorHAnsi" w:cstheme="minorHAnsi"/>
+          <w:noProof/>
+          <w:spacing w:val="-3"/>
+          <w:sz w:val="22"/>
+          <w:szCs w:val="22"/>
+        </w:rPr>
         <mc:AlternateContent>
           <mc:Choice Requires="wps">
             <w:drawing>
@@ -3396,7 +3357,7 @@
           </mc:Choice>
           <mc:Fallback>
             <w:pict>
-              <v:shape w14:anchorId="21D340D5" id="Cuadro de texto 3" o:spid="_x0000_s1028" type="#_x0000_t202" style="position:absolute;left:0;text-align:left;margin-left:18.75pt;margin-top:2.6pt;width:8.45pt;height:8.45pt;z-index:251659264;visibility:visible;mso-wrap-style:square;mso-wrap-distance-left:9pt;mso-wrap-distance-top:0;mso-wrap-distance-right:9pt;mso-wrap-distance-bottom:0;mso-position-horizontal:absolute;mso-position-horizontal-relative:text;mso-position-vertical:absolute;mso-position-vertical-relative:text;v-text-anchor:top" o:gfxdata="UEsDBBQABgAIAAAAIQC2gziS/gAAAOEBAAATAAAAW0NvbnRlbnRfVHlwZXNdLnhtbJSRQU7DMBBF 90jcwfIWJU67QAgl6YK0S0CoHGBkTxKLZGx5TGhvj5O2G0SRWNoz/78nu9wcxkFMGNg6quQqL6RA 0s5Y6ir5vt9lD1JwBDIwOMJKHpHlpr69KfdHjyxSmriSfYz+USnWPY7AufNIadK6MEJMx9ApD/oD OlTrorhX2lFEilmcO2RdNtjC5xDF9pCuTyYBB5bi6bQ4syoJ3g9WQ0ymaiLzg5KdCXlKLjvcW893 SUOqXwnz5DrgnHtJTxOsQfEKIT7DmDSUCaxw7Rqn8787ZsmRM9e2VmPeBN4uqYvTtW7jvijg9N/y JsXecLq0q+WD6m8AAAD//wMAUEsDBBQABgAIAAAAIQA4/SH/1gAAAJQBAAALAAAAX3JlbHMvLnJl bHOkkMFqwzAMhu+DvYPRfXGawxijTi+j0GvpHsDYimMaW0Yy2fr2M4PBMnrbUb/Q94l/f/hMi1qR JVI2sOt6UJgd+ZiDgffL8ekFlFSbvV0oo4EbChzGx4f9GRdb25HMsYhqlCwG5lrLq9biZkxWOiqY 22YiTra2kYMu1l1tQD30/bPm3wwYN0x18gb45AdQl1tp5j/sFB2T0FQ7R0nTNEV3j6o9feQzro1i OWA14Fm+Q8a1a8+Bvu/d/dMb2JY5uiPbhG/ktn4cqGU/er3pcvwCAAD//wMAUEsDBBQABgAIAAAA IQB8wqr1VAIAAAQFAAAOAAAAZHJzL2Uyb0RvYy54bWysVE1v2zAMvQ/YfxB0X+0E2boGcYosRYcB RVs0HXpWZCkxJouaxMTOfv0o2XGCrthh2EWmRD5+Pnp23daG7ZUPFdiCjy5yzpSVUFZ2U/Dvz7cf PnMWUNhSGLCq4AcV+PX8/btZ46ZqDFswpfKMnNgwbVzBt4hummVBblUtwgU4ZUmpwdcC6eo3WelF Q95rk43z/FPWgC+dB6lCoNebTsnnyb/WSuKD1kEhMwWn3DCdPp3reGbzmZhuvHDbSvZpiH/IohaV paCDqxuBgu189YerupIeAmi8kFBnoHUlVaqBqhnlr6pZbYVTqRZqTnBDm8L/cyvv9yv36Bm2X6Cl AcaGNC5MAz3Gelrt6/ilTBnpqYWHoW2qRSYjKL/Mr8acSVL1MnnJTmDnA35VULMoFNzTVFKzxP4u YGd6NImxjI1vpyyShAejOuWT0qwqKe44OUlUUUvj2V7QkMsfqQaKbixZRoiujBlAo7dABo+g3jbC VKLPAMzfAp6iDdYpIlgcgHVlwf8drDv7Y9VdrbFsbNctFRtr7QezhvJA8/LQUTk4eVtRV+9EwEfh ibs0ItpHfKBDG2gKDr3E2Rb8r7feoz1RirScNbQLBQ8/d8Irzsw3S2S7Gk0mcXnSZfLxckwXf65Z n2vsrl4CTWJEm+9kEqM9mqOoPdQvtLaLGJVUwkqKXXA8ikvsNpTWXqrFIhnRujiBd3blZHQduxw5 89y+CO96YiEx8h6OWyOmr/jV2UakhcUOQVeJfLHPXVf7/tOqJfr2v4W4y+f3ZHX6ec1/AwAA//8D AFBLAwQUAAYACAAAACEA6wGOH94AAAAGAQAADwAAAGRycy9kb3ducmV2LnhtbEyOwUrDQBRF94L/ MDzBjbSTxqRKzEsphS6EilhFXL5kxiQ48yZkpm3s1zuudHm5l3NPuZqsEUc9+t4xwmKegNDcONVz i/D2up3dg/CBWJFxrBG+tYdVdXlRUqHciV/0cR9aESHsC0LoQhgKKX3TaUt+7gbNsft0o6UQ49hK NdIpwq2RaZIspaWe40NHg950uvnaHywCPXd1789P5rz54PX2MdvR+80O8fpqWj+ACHoKf2P41Y/q UEWn2h1YeWEQbu/yuETIUxCxzrMMRI2QpguQVSn/61c/AAAA//8DAFBLAQItABQABgAIAAAAIQC2 gziS/gAAAOEBAAATAAAAAAAAAAAAAAAAAAAAAABbQ29udGVudF9UeXBlc10ueG1sUEsBAi0AFAAG AAgAAAAhADj9If/WAAAAlAEAAAsAAAAAAAAAAAAAAAAALwEAAF9yZWxzLy5yZWxzUEsBAi0AFAAG AAgAAAAhAHzCqvVUAgAABAUAAA4AAAAAAAAAAAAAAAAALgIAAGRycy9lMm9Eb2MueG1sUEsBAi0A FAAGAAgAAAAhAOsBjh/eAAAABgEAAA8AAAAAAAAAAAAAAAAArgQAAGRycy9kb3ducmV2LnhtbFBL BQYAAAAABAAEAPMAAAC5BQAAAAA= " fillcolor="white [3201]" strokecolor="black [3200]" strokeweight="2pt">
+              <v:shape w14:anchorId="21D340D5" id="Cuadro de texto 3" o:spid="_x0000_s1028" type="#_x0000_t202" style="position:absolute;left:0;text-align:left;margin-left:18.75pt;margin-top:2.6pt;width:8.45pt;height:8.45pt;z-index:251659264;visibility:visible;mso-wrap-style:square;mso-wrap-distance-left:9pt;mso-wrap-distance-top:0;mso-wrap-distance-right:9pt;mso-wrap-distance-bottom:0;mso-position-horizontal:absolute;mso-position-horizontal-relative:text;mso-position-vertical:absolute;mso-position-vertical-relative:text;v-text-anchor:top" o:gfxdata="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" fillcolor="white [3201]" strokecolor="black [3200]" strokeweight="2pt">
                 <v:textbox>
                   <w:txbxContent>
                     <w:p/>
@@ -3426,6 +3387,15 @@
           <w:lang w:val="es-ES_tradnl"/>
         </w:rPr>
         <w:tab/>
+      </w:r>
+      <w:r>
+        <w:rPr>
+          <w:rFonts w:ascii="Wingdings" w:hAnsi="Wingdings" w:cstheme="minorHAnsi"/>
+          <w:spacing w:val="-3"/>
+          <w:sz w:val="22"/>
+          <w:szCs w:val="22"/>
+          <w:lang w:val="es-ES_tradnl"/>
+        </w:rPr>
         <w:tab/>
       </w:r>
       <w:r>
@@ -3461,15 +3431,29 @@
           <w:szCs w:val="22"/>
           <w:lang w:val="es-ES_tradnl"/>
         </w:rPr>
-        <w:t xml:space="preserve">Importe de la Donación: {{IMPORTE}}€ ({{IMPORTE_LETRAS}} EUROS)</w:t>
-      </w:r>
-      <w:r>
-        <w:rPr>
-          <w:rFonts w:asciiTheme="minorHAnsi" w:hAnsiTheme="minorHAnsi" w:cstheme="minorHAnsi"/>
-          <w:sz w:val="22"/>
-          <w:szCs w:val="22"/>
-        </w:rPr>
-        <w:t xml:space="preserve"/>
+        <w:t>Importe de la Donación: {{IMPORTE</w:t>
+      </w:r>
+      <w:proofErr w:type="gramStart"/>
+      <w:r>
+        <w:rPr>
+          <w:rFonts w:asciiTheme="minorHAnsi" w:hAnsiTheme="minorHAnsi" w:cstheme="minorHAnsi"/>
+          <w:spacing w:val="-3"/>
+          <w:sz w:val="22"/>
+          <w:szCs w:val="22"/>
+          <w:lang w:val="es-ES_tradnl"/>
+        </w:rPr>
+        <w:t>}}€</w:t>
+      </w:r>
+      <w:proofErr w:type="gramEnd"/>
+      <w:r>
+        <w:rPr>
+          <w:rFonts w:asciiTheme="minorHAnsi" w:hAnsiTheme="minorHAnsi" w:cstheme="minorHAnsi"/>
+          <w:spacing w:val="-3"/>
+          <w:sz w:val="22"/>
+          <w:szCs w:val="22"/>
+          <w:lang w:val="es-ES_tradnl"/>
+        </w:rPr>
+        <w:t xml:space="preserve"> ({{IMPORTE_LETRAS}} EUROS)</w:t>
       </w:r>
     </w:p>
     <w:p>
@@ -3738,11 +3722,13 @@
       </w:pPr>
     </w:p>
     <w:sectPr>
-      <w:headerReference w:type="default" r:id="rId12"/>
-      <w:footerReference w:type="default" r:id="rId13"/>
+      <w:headerReference w:type="default" r:id="rId11"/>
+      <w:footerReference w:type="default" r:id="rId12"/>
+      <w:headerReference w:type="first" r:id="rId13"/>
       <w:pgSz w:w="11906" w:h="16838"/>
       <w:pgMar w:top="1797" w:right="1701" w:bottom="1417" w:left="1701" w:header="397" w:footer="708" w:gutter="0"/>
       <w:cols w:space="708"/>
+      <w:titlePg/>
       <w:docGrid w:linePitch="360"/>
     </w:sectPr>
   </w:body>
@@ -3852,7 +3838,7 @@
               <v:stroke joinstyle="miter"/>
               <v:path gradientshapeok="t" o:connecttype="rect"/>
             </v:shapetype>
-            <v:shape id="MSIPCM41c04b5ea11cb47ffac04b57" o:spid="_x0000_s1029" type="#_x0000_t202" alt="{&quot;HashCode&quot;:615583845,&quot;Height&quot;:841.0,&quot;Width&quot;:595.0,&quot;Placement&quot;:&quot;Footer&quot;,&quot;Index&quot;:&quot;Primary&quot;,&quot;Section&quot;:1,&quot;Top&quot;:0.0,&quot;Left&quot;:0.0}" style="position:absolute;left:0;text-align:left;margin-left:-92.25pt;margin-top:795.4pt;width:595.3pt;height:21pt;z-index:251661312;visibility:visible;mso-wrap-style:square;mso-wrap-distance-left:9pt;mso-wrap-distance-top:0;mso-wrap-distance-right:9pt;mso-wrap-distance-bottom:0;mso-position-horizontal:absolute;mso-position-horizontal-relative:page;mso-position-vertical:absolute;mso-position-vertical-relative:page;v-text-anchor:bottom" o:gfxdata="UEsDBBQABgAIAAAAIQC2gziS/gAAAOEBAAATAAAAW0NvbnRlbnRfVHlwZXNdLnhtbJSRQU7DMBBF 90jcwfIWJU67QAgl6YK0S0CoHGBkTxKLZGx5TGhvj5O2G0SRWNoz/78nu9wcxkFMGNg6quQqL6RA 0s5Y6ir5vt9lD1JwBDIwOMJKHpHlpr69KfdHjyxSmriSfYz+USnWPY7AufNIadK6MEJMx9ApD/oD OlTrorhX2lFEilmcO2RdNtjC5xDF9pCuTyYBB5bi6bQ4syoJ3g9WQ0ymaiLzg5KdCXlKLjvcW893 SUOqXwnz5DrgnHtJTxOsQfEKIT7DmDSUCaxw7Rqn8787ZsmRM9e2VmPeBN4uqYvTtW7jvijg9N/y JsXecLq0q+WD6m8AAAD//wMAUEsDBBQABgAIAAAAIQA4/SH/1gAAAJQBAAALAAAAX3JlbHMvLnJl bHOkkMFqwzAMhu+DvYPRfXGawxijTi+j0GvpHsDYimMaW0Yy2fr2M4PBMnrbUb/Q94l/f/hMi1qR JVI2sOt6UJgd+ZiDgffL8ekFlFSbvV0oo4EbChzGx4f9GRdb25HMsYhqlCwG5lrLq9biZkxWOiqY 22YiTra2kYMu1l1tQD30/bPm3wwYN0x18gb45AdQl1tp5j/sFB2T0FQ7R0nTNEV3j6o9feQzro1i OWA14Fm+Q8a1a8+Bvu/d/dMb2JY5uiPbhG/ktn4cqGU/er3pcvwCAAD//wMAUEsDBBQABgAIAAAA IQCetjTfFAIAACQEAAAOAAAAZHJzL2Uyb0RvYy54bWysU01v2zAMvQ/YfxB0X2ynbboZcYqsRYYB QVsgHXpWZCk2IImapMTOfv0o2UmKbqdhF5kmKX689zS/67UiB+F8C6aixSSnRBgOdWt2Ff3xsvr0 mRIfmKmZAiMqehSe3i0+fph3thRTaEDVwhEsYnzZ2Yo2IdgyyzxvhGZ+AlYYDEpwmgX8dbusdqzD 6lpl0zyfZR242jrgwnv0PgxBukj1pRQ8PEnpRSCqojhbSKdL5zae2WLOyp1jtmn5OAb7hyk0aw02 PZd6YIGRvWv/KKVb7sCDDBMOOgMpWy7SDrhNkb/bZtMwK9IuCI63Z5j8/yvLHw8b++xI6L9CjwRG QDrrS4/OuE8vnY5fnJRgHCE8nmETfSAcnbc3s/yqwBDH2HQ2u80TrtnltnU+fBOgSTQq6pCWhBY7 rH3Ajph6SonNDKxapRI1ypCuorOrmzxdOEfwhjJ48TJrtEK/7ccFtlAfcS8HA+Xe8lWLzdfMh2fm kGOcF3UbnvCQCrAJjBYlDbhff/PHfIQeo5R0qJmK+p975gQl6rtBUr4U19dRZOkHDffWuz15zV7f A8qxwJdheTJjblAnUzrQryjrZeyGIWY49qzo9mTeh0HB+Cy4WC5TEsrJsrA2G8tj6QhjhPSlf2XO jrgHZOwRTqpi5Tv4h9yBgOU+gGwTNxHYAc0Rb5Riomx8NlHrb/9T1uVxL34DAAD//wMAUEsDBBQA BgAIAAAAIQCZ5wHu4gAAAA8BAAAPAAAAZHJzL2Rvd25yZXYueG1sTI/NTsMwEITvSLyDtUjcWiel rdIQp0IgLkgIURBnJ978NPE6it02eXu2J7jtakYz32T7yfbijKNvHSmIlxEIpNKZlmoF31+viwSE D5qM7h2hghk97PPbm0ynxl3oE8+HUAsOIZ9qBU0IQyqlLxu02i/dgMRa5UarA79jLc2oLxxue7mK oq20uiVuaPSAzw2W3eFkFaw/dkUlj509vs9v89x21c9LUSl1fzc9PYIIOIU/M1zxGR1yZirciYwX vYJFnKw37GVls4t4xdXDjTGIgq/twyoBmWfy/478FwAA//8DAFBLAQItABQABgAIAAAAIQC2gziS /gAAAOEBAAATAAAAAAAAAAAAAAAAAAAAAABbQ29udGVudF9UeXBlc10ueG1sUEsBAi0AFAAGAAgA AAAhADj9If/WAAAAlAEAAAsAAAAAAAAAAAAAAAAALwEAAF9yZWxzLy5yZWxzUEsBAi0AFAAGAAgA AAAhAJ62NN8UAgAAJAQAAA4AAAAAAAAAAAAAAAAALgIAAGRycy9lMm9Eb2MueG1sUEsBAi0AFAAG AAgAAAAhAJnnAe7iAAAADwEAAA8AAAAAAAAAAAAAAAAAbgQAAGRycy9kb3ducmV2LnhtbFBLBQYA AAAABAAEAPMAAAB9BQAAAAA= " o:allowincell="f" filled="f" stroked="f" strokeweight=".5pt">
+            <v:shape id="MSIPCM41c04b5ea11cb47ffac04b57" o:spid="_x0000_s1029" type="#_x0000_t202" alt="{&quot;HashCode&quot;:615583845,&quot;Height&quot;:841.0,&quot;Width&quot;:595.0,&quot;Placement&quot;:&quot;Footer&quot;,&quot;Index&quot;:&quot;Primary&quot;,&quot;Section&quot;:1,&quot;Top&quot;:0.0,&quot;Left&quot;:0.0}" style="position:absolute;left:0;text-align:left;margin-left:-92.25pt;margin-top:795.4pt;width:595.3pt;height:21pt;z-index:251661312;visibility:visible;mso-wrap-style:square;mso-wrap-distance-left:9pt;mso-wrap-distance-top:0;mso-wrap-distance-right:9pt;mso-wrap-distance-bottom:0;mso-position-horizontal:absolute;mso-position-horizontal-relative:page;mso-position-vertical:absolute;mso-position-vertical-relative:page;v-text-anchor:bottom" o:gfxdata="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" o:allowincell="f" filled="f" stroked="f" strokeweight=".5pt">
               <v:textbox inset=",0,,0">
                 <w:txbxContent>
                   <w:p>
@@ -3929,6 +3915,93 @@
 </w:hdr>
 </file>
 
+<file path=word/header2.xml><?xml version="1.0" encoding="utf-8"?>
+<w:hdr xmlns:wpc="http://schemas.microsoft.com/office/word/2010/wordprocessingCanvas" xmlns:cx="http://schemas.microsoft.com/office/drawing/2014/chartex" xmlns:cx1="http://schemas.microsoft.com/office/drawing/2015/9/8/chartex" xmlns:cx2="http://schemas.microsoft.com/office/drawing/2015/10/21/chartex" xmlns:cx3="http://schemas.microsoft.com/office/drawing/2016/5/9/chartex" xmlns:cx4="http://schemas.microsoft.com/office/drawing/2016/5/10/chartex" xmlns:cx5="http://schemas.microsoft.com/office/drawing/2016/5/11/chartex" xmlns:cx6="http://schemas.microsoft.com/office/drawing/2016/5/12/chartex" xmlns:cx7="http://schemas.microsoft.com/office/drawing/2016/5/13/chartex" xmlns:cx8="http://schemas.microsoft.com/office/drawing/2016/5/14/chartex" xmlns:mc="http://schemas.openxmlformats.org/markup-compatibility/2006" xmlns:aink="http://schemas.microsoft.com/office/drawing/2016/ink" xmlns:am3d="http://schemas.microsoft.com/office/drawing/2017/model3d" xmlns:o="urn:schemas-microsoft-com:office:office" xmlns:oel="http://schemas.microsoft.com/office/2019/extlst" xmlns:r="http://schemas.openxmlformats.org/officeDocument/2006/relationships" xmlns:m="http://schemas.openxmlformats.org/officeDocument/2006/math" xmlns:v="urn:schemas-microsoft-com:vml" xmlns:wp14="http://schemas.microsoft.com/office/word/2010/wordprocessingDrawing" xmlns:wp="http://schemas.openxmlformats.org/drawingml/2006/wordprocessingDrawing" xmlns:w10="urn:schemas-microsoft-com:office:word" xmlns:w="http://schemas.openxmlformats.org/wordprocessingml/2006/main" xmlns:w14="http://schemas.microsoft.com/office/word/2010/wordml" xmlns:w15="http://schemas.microsoft.com/office/word/2012/wordml" xmlns:w16cex="http://schemas.microsoft.com/office/word/2018/wordml/cex" xmlns:w16cid="http://schemas.microsoft.com/office/word/2016/wordml/cid" xmlns:w16="http://schemas.microsoft.com/office/word/2018/wordml" xmlns:w16du="http://schemas.microsoft.com/office/word/2023/wordml/word16du" xmlns:w16sdtdh="http://schemas.microsoft.com/office/word/2020/wordml/sdtdatahash" xmlns:w16sdtfl="http://schemas.microsoft.com/office/word/2024/wordml/sdtformatlock" xmlns:w16se="http://schemas.microsoft.com/office/word/2015/wordml/symex" xmlns:wpg="http://schemas.microsoft.com/office/word/2010/wordprocessingGroup" xmlns:wpi="http://schemas.microsoft.com/office/word/2010/wordprocessingInk" xmlns:wne="http://schemas.microsoft.com/office/word/2006/wordml" xmlns:wps="http://schemas.microsoft.com/office/word/2010/wordprocessingShape" mc:Ignorable="w14 w15 w16se w16cid w16 w16cex w16sdtdh w16sdtfl w16du wp14">
+  <w:p>
+    <w:pPr>
+      <w:pStyle w:val="Encabezado"/>
+      <w:ind w:left="-709"/>
+    </w:pPr>
+    <w:r>
+      <w:rPr>
+        <w:noProof/>
+      </w:rPr>
+      <w:drawing>
+        <wp:anchor distT="0" distB="0" distL="114935" distR="114935" simplePos="0" relativeHeight="251663360" behindDoc="1" locked="0" layoutInCell="0" allowOverlap="1" wp14:anchorId="49E73676" wp14:editId="4621346B">
+          <wp:simplePos x="0" y="0"/>
+          <wp:positionH relativeFrom="column">
+            <wp:posOffset>4038600</wp:posOffset>
+          </wp:positionH>
+          <wp:positionV relativeFrom="paragraph">
+            <wp:posOffset>-266065</wp:posOffset>
+          </wp:positionV>
+          <wp:extent cx="1813560" cy="1242060"/>
+          <wp:effectExtent l="0" t="0" r="0" b="0"/>
+          <wp:wrapTight wrapText="bothSides">
+            <wp:wrapPolygon edited="0">
+              <wp:start x="-111" y="0"/>
+              <wp:lineTo x="-111" y="21428"/>
+              <wp:lineTo x="21600" y="21428"/>
+              <wp:lineTo x="21600" y="0"/>
+              <wp:lineTo x="-111" y="0"/>
+            </wp:wrapPolygon>
+          </wp:wrapTight>
+          <wp:docPr id="1882687201" name="Imagen 2"/>
+          <wp:cNvGraphicFramePr>
+            <a:graphicFrameLocks xmlns:a="http://schemas.openxmlformats.org/drawingml/2006/main" noChangeAspect="1"/>
+          </wp:cNvGraphicFramePr>
+          <a:graphic xmlns:a="http://schemas.openxmlformats.org/drawingml/2006/main">
+            <a:graphicData uri="http://schemas.openxmlformats.org/drawingml/2006/picture">
+              <pic:pic xmlns:pic="http://schemas.openxmlformats.org/drawingml/2006/picture">
+                <pic:nvPicPr>
+                  <pic:cNvPr id="1" name="Imagen 2"/>
+                  <pic:cNvPicPr>
+                    <a:picLocks noChangeAspect="1" noChangeArrowheads="1"/>
+                  </pic:cNvPicPr>
+                </pic:nvPicPr>
+                <pic:blipFill>
+                  <a:blip r:embed="rId1"/>
+                  <a:srcRect l="-16" t="-23" r="-16" b="-23"/>
+                  <a:stretch>
+                    <a:fillRect/>
+                  </a:stretch>
+                </pic:blipFill>
+                <pic:spPr bwMode="auto">
+                  <a:xfrm>
+                    <a:off x="0" y="0"/>
+                    <a:ext cx="1813560" cy="1242060"/>
+                  </a:xfrm>
+                  <a:prstGeom prst="rect">
+                    <a:avLst/>
+                  </a:prstGeom>
+                </pic:spPr>
+              </pic:pic>
+            </a:graphicData>
+          </a:graphic>
+        </wp:anchor>
+      </w:drawing>
+    </w:r>
+    <w:r>
+      <w:t>{{LOGO}}</w:t>
+    </w:r>
+    <w:r>
+      <w:rPr>
+        <w:lang w:eastAsia="en-US"/>
+      </w:rPr>
+      <w:t xml:space="preserve"> </w:t>
+    </w:r>
+  </w:p>
+  <w:p>
+    <w:pPr>
+      <w:pStyle w:val="Encabezado"/>
+    </w:pPr>
+    <w:r>
+      <w:t xml:space="preserve">                                                                                                                                     </w:t>
+    </w:r>
+  </w:p>
+</w:hdr>
+</file>
+
 <file path=word/numbering.xml><?xml version="1.0" encoding="utf-8"?>
 <w:numbering xmlns:wpc="http://schemas.microsoft.com/office/word/2010/wordprocessingCanvas" xmlns:cx="http://schemas.microsoft.com/office/drawing/2014/chartex" xmlns:cx1="http://schemas.microsoft.com/office/drawing/2015/9/8/chartex" xmlns:cx2="http://schemas.microsoft.com/office/drawing/2015/10/21/chartex" xmlns:cx3="http://schemas.microsoft.com/office/drawing/2016/5/9/chartex" xmlns:cx4="http://schemas.microsoft.com/office/drawing/2016/5/10/chartex" xmlns:cx5="http://schemas.microsoft.com/office/drawing/2016/5/11/chartex" xmlns:cx6="http://schemas.microsoft.com/office/drawing/2016/5/12/chartex" xmlns:cx7="http://schemas.microsoft.com/office/drawing/2016/5/13/chartex" xmlns:cx8="http://schemas.microsoft.com/office/drawing/2016/5/14/chartex" xmlns:mc="http://schemas.openxmlformats.org/markup-compatibility/2006" xmlns:aink="http://schemas.microsoft.com/office/drawing/2016/ink" xmlns:am3d="http://schemas.microsoft.com/office/drawing/2017/model3d" xmlns:o="urn:schemas-microsoft-com:office:office" xmlns:oel="http://schemas.microsoft.com/office/2019/extlst" xmlns:r="http://schemas.openxmlformats.org/officeDocument/2006/relationships" xmlns:m="http://schemas.openxmlformats.org/officeDocument/2006/math" xmlns:v="urn:schemas-microsoft-com:vml" xmlns:wp14="http://schemas.microsoft.com/office/word/2010/wordprocessingDrawing" xmlns:wp="http://schemas.openxmlformats.org/drawingml/2006/wordprocessingDrawing" xmlns:w10="urn:schemas-microsoft-com:office:word" xmlns:w="http://schemas.openxmlformats.org/wordprocessingml/2006/main" xmlns:w14="http://schemas.microsoft.com/office/word/2010/wordml" xmlns:w15="http://schemas.microsoft.com/office/word/2012/wordml" xmlns:w16cex="http://schemas.microsoft.com/office/word/2018/wordml/cex" xmlns:w16cid="http://schemas.microsoft.com/office/word/2016/wordml/cid" xmlns:w16="http://schemas.microsoft.com/office/word/2018/wordml" xmlns:w16du="http://schemas.microsoft.com/office/word/2023/wordml/word16du" xmlns:w16sdtdh="http://schemas.microsoft.com/office/word/2020/wordml/sdtdatahash" xmlns:w16sdtfl="http://schemas.microsoft.com/office/word/2024/wordml/sdtformatlock" xmlns:w16se="http://schemas.microsoft.com/office/word/2015/wordml/symex" xmlns:wpg="http://schemas.microsoft.com/office/word/2010/wordprocessingGroup" xmlns:wpi="http://schemas.microsoft.com/office/word/2010/wordprocessingInk" xmlns:wne="http://schemas.microsoft.com/office/word/2006/wordml" xmlns:wps="http://schemas.microsoft.com/office/word/2010/wordprocessingShape" mc:Ignorable="w14 w15 w16se w16cid w16 w16cex w16sdtdh w16sdtfl w16du wp14">
   <w:abstractNum w:abstractNumId="0" w15:restartNumberingAfterBreak="0">
@@ -4977,7 +5050,7 @@
     <w:lsdException w:name="Normal Indent" w:semiHidden="1" w:unhideWhenUsed="1"/>
     <w:lsdException w:name="footnote text" w:semiHidden="1" w:unhideWhenUsed="1"/>
     <w:lsdException w:name="annotation text" w:semiHidden="1" w:unhideWhenUsed="1"/>
-    <w:lsdException w:name="header" w:semiHidden="1" w:unhideWhenUsed="1"/>
+    <w:lsdException w:name="header" w:semiHidden="1" w:uiPriority="0" w:unhideWhenUsed="1"/>
     <w:lsdException w:name="footer" w:semiHidden="1" w:unhideWhenUsed="1"/>
     <w:lsdException w:name="index heading" w:semiHidden="1" w:unhideWhenUsed="1"/>
     <w:lsdException w:name="caption" w:semiHidden="1" w:uiPriority="35" w:unhideWhenUsed="1" w:qFormat="1"/>
@@ -5368,7 +5441,6 @@
     <w:name w:val="header"/>
     <w:basedOn w:val="Normal"/>
     <w:link w:val="EncabezadoCar"/>
-    <w:uiPriority w:val="99"/>
     <w:unhideWhenUsed/>
     <w:rsid w:val="007C0B45"/>
     <w:pPr>

</xml_diff>